<commit_message>
prototype-01_note object added +functionalities
</commit_message>
<xml_diff>
--- a/00_design-concept-reports/yutika-shindolkar_design-concept-report-01.docx
+++ b/00_design-concept-reports/yutika-shindolkar_design-concept-report-01.docx
@@ -1797,15 +1797,13 @@
         </w:rPr>
         <w:t xml:space="preserve">once a second note exists, all notes gain small handles on their four edges with a subtle glow/pulse micro-interaction </w:t>
       </w:r>
-      <w:proofErr w:type="spellStart"/>
-      <w:r>
-        <w:rPr>
-          <w:sz w:val="20"/>
-          <w:szCs w:val="20"/>
-        </w:rPr>
-        <w:t>signalling</w:t>
-      </w:r>
-      <w:proofErr w:type="spellEnd"/>
+      <w:r>
+        <w:rPr>
+          <w:sz w:val="20"/>
+          <w:szCs w:val="20"/>
+        </w:rPr>
+        <w:t>signaling</w:t>
+      </w:r>
       <w:r>
         <w:rPr>
           <w:sz w:val="20"/>

</xml_diff>